<commit_message>
add python list , and set programs program
</commit_message>
<xml_diff>
--- a/Sem-2/Python/Provided data/PYTHON INDICATIVE LIST.docx
+++ b/Sem-2/Python/Provided data/PYTHON INDICATIVE LIST.docx
@@ -1899,7 +1899,6 @@
           <w:sz w:val="28"/>
           <w:szCs w:val="28"/>
         </w:rPr>
-        <w:lastRenderedPageBreak/>
         <w:t>Print the number pyramid using range()</w:t>
       </w:r>
     </w:p>
@@ -2413,409 +2412,530 @@
           <w:szCs w:val="28"/>
         </w:rPr>
       </w:pPr>
+      <w:r>
+        <w:rPr>
+          <w:sz w:val="28"/>
+          <w:szCs w:val="28"/>
+        </w:rPr>
+        <w:t>Take a tuple input and print all the elements of it in reverse sequence</w:t>
+      </w:r>
+    </w:p>
+    <w:p>
+      <w:pPr>
+        <w:pStyle w:val="TableParagraph"/>
+        <w:numPr>
+          <w:ilvl w:val="0"/>
+          <w:numId w:val="4"/>
+        </w:numPr>
+        <w:rPr>
+          <w:sz w:val="28"/>
+          <w:szCs w:val="28"/>
+        </w:rPr>
+      </w:pPr>
+      <w:r>
+        <w:rPr>
+          <w:sz w:val="28"/>
+          <w:szCs w:val="28"/>
+        </w:rPr>
+        <w:t xml:space="preserve">Copy the inputted string to another string by replacing the character ‘o’ with ‘@’ </w:t>
+      </w:r>
+      <w:proofErr w:type="spellStart"/>
+      <w:r>
+        <w:rPr>
+          <w:sz w:val="28"/>
+          <w:szCs w:val="28"/>
+        </w:rPr>
+        <w:t>Eg</w:t>
+      </w:r>
+      <w:proofErr w:type="spellEnd"/>
+      <w:r>
+        <w:rPr>
+          <w:sz w:val="28"/>
+          <w:szCs w:val="28"/>
+        </w:rPr>
+        <w:t xml:space="preserve">. ‘Hello’ will be copied to another string as ‘Hell@’ and ‘Good Morning’ will become ‘G@@d </w:t>
+      </w:r>
+      <w:proofErr w:type="spellStart"/>
+      <w:r>
+        <w:rPr>
+          <w:sz w:val="28"/>
+          <w:szCs w:val="28"/>
+        </w:rPr>
+        <w:t>M@rning</w:t>
+      </w:r>
+      <w:proofErr w:type="spellEnd"/>
+      <w:r>
+        <w:rPr>
+          <w:sz w:val="28"/>
+          <w:szCs w:val="28"/>
+        </w:rPr>
+        <w:t>’ (Without using replace())</w:t>
+      </w:r>
+    </w:p>
+    <w:p>
+      <w:pPr>
+        <w:pStyle w:val="TableParagraph"/>
+        <w:numPr>
+          <w:ilvl w:val="0"/>
+          <w:numId w:val="4"/>
+        </w:numPr>
+        <w:rPr>
+          <w:sz w:val="28"/>
+          <w:szCs w:val="28"/>
+        </w:rPr>
+      </w:pPr>
+      <w:r>
+        <w:rPr>
+          <w:sz w:val="28"/>
+          <w:szCs w:val="28"/>
+        </w:rPr>
+        <w:t>Take a string as an input from the user. Find total number of vowels in it. (Hint: take a tuple of vowels)</w:t>
+      </w:r>
+    </w:p>
+    <w:p>
+      <w:pPr>
+        <w:pStyle w:val="TableParagraph"/>
+        <w:numPr>
+          <w:ilvl w:val="0"/>
+          <w:numId w:val="4"/>
+        </w:numPr>
+        <w:rPr>
+          <w:sz w:val="28"/>
+          <w:szCs w:val="28"/>
+        </w:rPr>
+      </w:pPr>
+      <w:r>
+        <w:rPr>
+          <w:sz w:val="28"/>
+          <w:szCs w:val="28"/>
+        </w:rPr>
+        <w:t>Create a tuple for name say t1 (</w:t>
+      </w:r>
+      <w:proofErr w:type="spellStart"/>
+      <w:r>
+        <w:rPr>
+          <w:sz w:val="28"/>
+          <w:szCs w:val="28"/>
+        </w:rPr>
+        <w:t>FirstName</w:t>
+      </w:r>
+      <w:proofErr w:type="spellEnd"/>
+      <w:r>
+        <w:rPr>
+          <w:sz w:val="28"/>
+          <w:szCs w:val="28"/>
+        </w:rPr>
+        <w:t xml:space="preserve">, </w:t>
+      </w:r>
+      <w:proofErr w:type="spellStart"/>
+      <w:r>
+        <w:rPr>
+          <w:sz w:val="28"/>
+          <w:szCs w:val="28"/>
+        </w:rPr>
+        <w:t>MiddleName</w:t>
+      </w:r>
+      <w:proofErr w:type="spellEnd"/>
+      <w:r>
+        <w:rPr>
+          <w:sz w:val="28"/>
+          <w:szCs w:val="28"/>
+        </w:rPr>
+        <w:t xml:space="preserve">, </w:t>
+      </w:r>
+      <w:proofErr w:type="spellStart"/>
+      <w:r>
+        <w:rPr>
+          <w:sz w:val="28"/>
+          <w:szCs w:val="28"/>
+        </w:rPr>
+        <w:t>LastName</w:t>
+      </w:r>
+      <w:proofErr w:type="spellEnd"/>
+      <w:r>
+        <w:rPr>
+          <w:sz w:val="28"/>
+          <w:szCs w:val="28"/>
+        </w:rPr>
+        <w:t>)</w:t>
+      </w:r>
+    </w:p>
+    <w:p>
+      <w:pPr>
+        <w:pStyle w:val="TableParagraph"/>
+        <w:numPr>
+          <w:ilvl w:val="0"/>
+          <w:numId w:val="4"/>
+        </w:numPr>
+        <w:rPr>
+          <w:sz w:val="28"/>
+          <w:szCs w:val="28"/>
+        </w:rPr>
+      </w:pPr>
+      <w:r>
+        <w:rPr>
+          <w:sz w:val="28"/>
+          <w:szCs w:val="28"/>
+        </w:rPr>
+        <w:t xml:space="preserve">Create a tuple say t2 for marks of 5 subjects </w:t>
+      </w:r>
+    </w:p>
+    <w:p>
+      <w:pPr>
+        <w:pStyle w:val="TableParagraph"/>
+        <w:numPr>
+          <w:ilvl w:val="0"/>
+          <w:numId w:val="4"/>
+        </w:numPr>
+        <w:rPr>
+          <w:sz w:val="28"/>
+          <w:szCs w:val="28"/>
+        </w:rPr>
+      </w:pPr>
+      <w:r>
+        <w:rPr>
+          <w:sz w:val="28"/>
+          <w:szCs w:val="28"/>
+        </w:rPr>
+        <w:t>Make a total of all the marks and print it. (with and without using sum() method)</w:t>
+      </w:r>
+    </w:p>
+    <w:p>
+      <w:pPr>
+        <w:pStyle w:val="TableParagraph"/>
+        <w:numPr>
+          <w:ilvl w:val="0"/>
+          <w:numId w:val="4"/>
+        </w:numPr>
+        <w:rPr>
+          <w:sz w:val="28"/>
+          <w:szCs w:val="28"/>
+        </w:rPr>
+      </w:pPr>
+      <w:r>
+        <w:rPr>
+          <w:sz w:val="28"/>
+          <w:szCs w:val="28"/>
+        </w:rPr>
+        <w:t>Make a tuple t3 having 2 elements as t1 and t2 (tuples created above) – It is called a nested tuple</w:t>
+      </w:r>
+    </w:p>
+    <w:p>
+      <w:pPr>
+        <w:pStyle w:val="TableParagraph"/>
+        <w:numPr>
+          <w:ilvl w:val="0"/>
+          <w:numId w:val="4"/>
+        </w:numPr>
+        <w:rPr>
+          <w:sz w:val="28"/>
+          <w:szCs w:val="28"/>
+        </w:rPr>
+      </w:pPr>
+      <w:r>
+        <w:rPr>
+          <w:sz w:val="28"/>
+          <w:szCs w:val="28"/>
+        </w:rPr>
+        <w:t>Take an input number and find whether that is present as an element in the tuple t3 or not.</w:t>
+      </w:r>
+    </w:p>
+    <w:p>
+      <w:pPr>
+        <w:pStyle w:val="TableParagraph"/>
+        <w:numPr>
+          <w:ilvl w:val="0"/>
+          <w:numId w:val="4"/>
+        </w:numPr>
+        <w:rPr>
+          <w:sz w:val="28"/>
+          <w:szCs w:val="28"/>
+        </w:rPr>
+      </w:pPr>
+      <w:r>
+        <w:rPr>
+          <w:sz w:val="28"/>
+          <w:szCs w:val="28"/>
+        </w:rPr>
+        <w:t>Create a tuple of 5 fruits. Ask the user to input a fruit name and search that name in the given fruit tuple. Display suitable messages</w:t>
+      </w:r>
+    </w:p>
+    <w:p>
+      <w:pPr>
+        <w:pStyle w:val="TableParagraph"/>
+        <w:numPr>
+          <w:ilvl w:val="0"/>
+          <w:numId w:val="4"/>
+        </w:numPr>
+        <w:rPr>
+          <w:sz w:val="28"/>
+          <w:szCs w:val="28"/>
+        </w:rPr>
+      </w:pPr>
+      <w:r>
+        <w:rPr>
+          <w:sz w:val="28"/>
+          <w:szCs w:val="28"/>
+        </w:rPr>
+        <w:t>Create a tuple of cities of Gujarat by taking user input.</w:t>
+      </w:r>
+    </w:p>
+    <w:p>
+      <w:pPr>
+        <w:pStyle w:val="TableParagraph"/>
+        <w:numPr>
+          <w:ilvl w:val="0"/>
+          <w:numId w:val="4"/>
+        </w:numPr>
+        <w:rPr>
+          <w:sz w:val="28"/>
+          <w:szCs w:val="28"/>
+        </w:rPr>
+      </w:pPr>
+      <w:r>
+        <w:rPr>
+          <w:sz w:val="28"/>
+          <w:szCs w:val="28"/>
+        </w:rPr>
+        <w:t xml:space="preserve">Find the length of name of each city in the above tuple. With and without </w:t>
+      </w:r>
+      <w:proofErr w:type="spellStart"/>
+      <w:r>
+        <w:rPr>
+          <w:sz w:val="28"/>
+          <w:szCs w:val="28"/>
+        </w:rPr>
+        <w:t>len</w:t>
+      </w:r>
+      <w:proofErr w:type="spellEnd"/>
+      <w:r>
+        <w:rPr>
+          <w:sz w:val="28"/>
+          <w:szCs w:val="28"/>
+        </w:rPr>
+        <w:t>() method</w:t>
+      </w:r>
+    </w:p>
+    <w:p>
+      <w:pPr>
+        <w:pStyle w:val="TableParagraph"/>
+        <w:numPr>
+          <w:ilvl w:val="0"/>
+          <w:numId w:val="4"/>
+        </w:numPr>
+        <w:rPr>
+          <w:sz w:val="28"/>
+          <w:szCs w:val="28"/>
+        </w:rPr>
+      </w:pPr>
+      <w:r>
+        <w:rPr>
+          <w:sz w:val="28"/>
+          <w:szCs w:val="28"/>
+        </w:rPr>
+        <w:t>Create a nested tuple t4 of your (name, (hobbies), (friends), degree)</w:t>
+      </w:r>
+    </w:p>
+    <w:p>
+      <w:pPr>
+        <w:pStyle w:val="TableParagraph"/>
+        <w:numPr>
+          <w:ilvl w:val="0"/>
+          <w:numId w:val="4"/>
+        </w:numPr>
+        <w:rPr>
+          <w:sz w:val="28"/>
+          <w:szCs w:val="28"/>
+        </w:rPr>
+      </w:pPr>
+      <w:r>
+        <w:rPr>
+          <w:sz w:val="28"/>
+          <w:szCs w:val="28"/>
+        </w:rPr>
+        <w:t>Find an element in the nested tuple (t4) and print its position if found, otherwise print “Not found”</w:t>
+      </w:r>
+    </w:p>
+    <w:p>
+      <w:pPr>
+        <w:pStyle w:val="TableParagraph"/>
+        <w:numPr>
+          <w:ilvl w:val="0"/>
+          <w:numId w:val="4"/>
+        </w:numPr>
+        <w:rPr>
+          <w:sz w:val="28"/>
+          <w:szCs w:val="28"/>
+        </w:rPr>
+      </w:pPr>
+      <w:r>
+        <w:rPr>
+          <w:sz w:val="28"/>
+          <w:szCs w:val="28"/>
+        </w:rPr>
+        <w:t>Take a tuple of 10 integer numbers and segregate odd and even numbers in 2 different tuples.</w:t>
+      </w:r>
+    </w:p>
+    <w:p>
+      <w:pPr>
+        <w:pStyle w:val="TableParagraph"/>
+        <w:ind w:left="720"/>
+        <w:rPr>
+          <w:sz w:val="28"/>
+          <w:szCs w:val="28"/>
+        </w:rPr>
+      </w:pPr>
+    </w:p>
+    <w:p>
+      <w:pPr>
+        <w:pStyle w:val="TableParagraph"/>
+        <w:numPr>
+          <w:ilvl w:val="0"/>
+          <w:numId w:val="4"/>
+        </w:numPr>
+        <w:rPr>
+          <w:sz w:val="28"/>
+          <w:szCs w:val="28"/>
+        </w:rPr>
+      </w:pPr>
+      <w:r>
+        <w:rPr>
+          <w:sz w:val="28"/>
+          <w:szCs w:val="28"/>
+        </w:rPr>
+        <w:t>Create a list of students say L1</w:t>
+      </w:r>
+    </w:p>
+    <w:p>
+      <w:pPr>
+        <w:pStyle w:val="TableParagraph"/>
+        <w:numPr>
+          <w:ilvl w:val="1"/>
+          <w:numId w:val="4"/>
+        </w:numPr>
+        <w:rPr>
+          <w:sz w:val="28"/>
+          <w:szCs w:val="28"/>
+        </w:rPr>
+      </w:pPr>
+      <w:r>
+        <w:rPr>
+          <w:sz w:val="28"/>
+          <w:szCs w:val="28"/>
+        </w:rPr>
+        <w:t>Count total number of students from the list</w:t>
+      </w:r>
+      <w:r>
+        <w:rPr>
+          <w:sz w:val="28"/>
+          <w:szCs w:val="28"/>
+        </w:rPr>
+        <w:t xml:space="preserve"> L1</w:t>
+      </w:r>
+    </w:p>
+    <w:p>
+      <w:pPr>
+        <w:pStyle w:val="TableParagraph"/>
+        <w:numPr>
+          <w:ilvl w:val="1"/>
+          <w:numId w:val="4"/>
+        </w:numPr>
+        <w:rPr>
+          <w:sz w:val="28"/>
+          <w:szCs w:val="28"/>
+        </w:rPr>
+      </w:pPr>
+      <w:r>
+        <w:rPr>
+          <w:sz w:val="28"/>
+          <w:szCs w:val="28"/>
+        </w:rPr>
+        <w:t>Add one more student in the list L1</w:t>
+      </w:r>
+    </w:p>
+    <w:p>
+      <w:pPr>
+        <w:pStyle w:val="TableParagraph"/>
+        <w:numPr>
+          <w:ilvl w:val="1"/>
+          <w:numId w:val="4"/>
+        </w:numPr>
+        <w:rPr>
+          <w:sz w:val="28"/>
+          <w:szCs w:val="28"/>
+        </w:rPr>
+      </w:pPr>
+      <w:r>
+        <w:rPr>
+          <w:sz w:val="28"/>
+          <w:szCs w:val="28"/>
+        </w:rPr>
+        <w:t>Display all the students in the sorted order</w:t>
+      </w:r>
+    </w:p>
+    <w:p>
+      <w:pPr>
+        <w:pStyle w:val="TableParagraph"/>
+        <w:numPr>
+          <w:ilvl w:val="1"/>
+          <w:numId w:val="4"/>
+        </w:numPr>
+        <w:rPr>
+          <w:sz w:val="28"/>
+          <w:szCs w:val="28"/>
+        </w:rPr>
+      </w:pPr>
+      <w:r>
+        <w:rPr>
+          <w:sz w:val="28"/>
+          <w:szCs w:val="28"/>
+        </w:rPr>
+        <w:t>Check a particular student’s name is present in the list or not</w:t>
+      </w:r>
+    </w:p>
+    <w:p>
+      <w:pPr>
+        <w:pStyle w:val="TableParagraph"/>
+        <w:numPr>
+          <w:ilvl w:val="1"/>
+          <w:numId w:val="4"/>
+        </w:numPr>
+        <w:rPr>
+          <w:sz w:val="28"/>
+          <w:szCs w:val="28"/>
+        </w:rPr>
+      </w:pPr>
+      <w:r>
+        <w:rPr>
+          <w:sz w:val="28"/>
+          <w:szCs w:val="28"/>
+        </w:rPr>
+        <w:t>If the student’s name is present in the list, print total number of same name students in the list L1 and display the position of 1</w:t>
+      </w:r>
+      <w:r>
+        <w:rPr>
+          <w:sz w:val="28"/>
+          <w:szCs w:val="28"/>
+          <w:vertAlign w:val="superscript"/>
+        </w:rPr>
+        <w:t>st</w:t>
+      </w:r>
+      <w:r>
+        <w:rPr>
+          <w:sz w:val="28"/>
+          <w:szCs w:val="28"/>
+        </w:rPr>
+        <w:t xml:space="preserve"> student</w:t>
+      </w:r>
+      <w:r>
+        <w:rPr>
+          <w:sz w:val="28"/>
+          <w:szCs w:val="28"/>
+        </w:rPr>
+        <w:t xml:space="preserve"> and then positions of all other students also with same name</w:t>
+      </w:r>
       <w:bookmarkStart w:id="0" w:name="_GoBack"/>
       <w:bookmarkEnd w:id="0"/>
-      <w:r>
-        <w:rPr>
-          <w:sz w:val="28"/>
-          <w:szCs w:val="28"/>
-        </w:rPr>
-        <w:t>Take a tuple input and print all the elements of it in reverse sequence</w:t>
-      </w:r>
-    </w:p>
-    <w:p>
-      <w:pPr>
-        <w:pStyle w:val="TableParagraph"/>
-        <w:numPr>
-          <w:ilvl w:val="0"/>
-          <w:numId w:val="4"/>
-        </w:numPr>
-        <w:rPr>
-          <w:sz w:val="28"/>
-          <w:szCs w:val="28"/>
-        </w:rPr>
-      </w:pPr>
-      <w:r>
-        <w:rPr>
-          <w:sz w:val="28"/>
-          <w:szCs w:val="28"/>
-        </w:rPr>
-        <w:t xml:space="preserve">Copy the inputted string to another string by replacing the character ‘o’ with ‘@’ </w:t>
-      </w:r>
-      <w:proofErr w:type="spellStart"/>
-      <w:r>
-        <w:rPr>
-          <w:sz w:val="28"/>
-          <w:szCs w:val="28"/>
-        </w:rPr>
-        <w:t>Eg</w:t>
-      </w:r>
-      <w:proofErr w:type="spellEnd"/>
-      <w:r>
-        <w:rPr>
-          <w:sz w:val="28"/>
-          <w:szCs w:val="28"/>
-        </w:rPr>
-        <w:t xml:space="preserve">. ‘Hello’ will be copied to another string as ‘Hell@’ and ‘Good Morning’ will become ‘G@@d </w:t>
-      </w:r>
-      <w:proofErr w:type="spellStart"/>
-      <w:r>
-        <w:rPr>
-          <w:sz w:val="28"/>
-          <w:szCs w:val="28"/>
-        </w:rPr>
-        <w:t>M@rning</w:t>
-      </w:r>
-      <w:proofErr w:type="spellEnd"/>
-      <w:r>
-        <w:rPr>
-          <w:sz w:val="28"/>
-          <w:szCs w:val="28"/>
-        </w:rPr>
-        <w:t>’ (Without using replace())</w:t>
-      </w:r>
-    </w:p>
-    <w:p>
-      <w:pPr>
-        <w:pStyle w:val="TableParagraph"/>
-        <w:numPr>
-          <w:ilvl w:val="0"/>
-          <w:numId w:val="4"/>
-        </w:numPr>
-        <w:rPr>
-          <w:sz w:val="28"/>
-          <w:szCs w:val="28"/>
-        </w:rPr>
-      </w:pPr>
-      <w:r>
-        <w:rPr>
-          <w:sz w:val="28"/>
-          <w:szCs w:val="28"/>
-        </w:rPr>
-        <w:t xml:space="preserve">Take a string as an input from the user. Find total number of vowels in it. </w:t>
-      </w:r>
-      <w:r>
-        <w:rPr>
-          <w:sz w:val="28"/>
-          <w:szCs w:val="28"/>
-        </w:rPr>
-        <w:lastRenderedPageBreak/>
-        <w:t>(Hint: take a tuple of vowels)</w:t>
-      </w:r>
-    </w:p>
-    <w:p>
-      <w:pPr>
-        <w:pStyle w:val="TableParagraph"/>
-        <w:numPr>
-          <w:ilvl w:val="0"/>
-          <w:numId w:val="4"/>
-        </w:numPr>
-        <w:rPr>
-          <w:sz w:val="28"/>
-          <w:szCs w:val="28"/>
-        </w:rPr>
-      </w:pPr>
-      <w:r>
-        <w:rPr>
-          <w:sz w:val="28"/>
-          <w:szCs w:val="28"/>
-        </w:rPr>
-        <w:t>Create a tuple for name say t1 (</w:t>
-      </w:r>
-      <w:proofErr w:type="spellStart"/>
-      <w:r>
-        <w:rPr>
-          <w:sz w:val="28"/>
-          <w:szCs w:val="28"/>
-        </w:rPr>
-        <w:t>FirstName</w:t>
-      </w:r>
-      <w:proofErr w:type="spellEnd"/>
-      <w:r>
-        <w:rPr>
-          <w:sz w:val="28"/>
-          <w:szCs w:val="28"/>
-        </w:rPr>
-        <w:t xml:space="preserve">, </w:t>
-      </w:r>
-      <w:proofErr w:type="spellStart"/>
-      <w:r>
-        <w:rPr>
-          <w:sz w:val="28"/>
-          <w:szCs w:val="28"/>
-        </w:rPr>
-        <w:t>MiddleName</w:t>
-      </w:r>
-      <w:proofErr w:type="spellEnd"/>
-      <w:r>
-        <w:rPr>
-          <w:sz w:val="28"/>
-          <w:szCs w:val="28"/>
-        </w:rPr>
-        <w:t xml:space="preserve">, </w:t>
-      </w:r>
-      <w:proofErr w:type="spellStart"/>
-      <w:r>
-        <w:rPr>
-          <w:sz w:val="28"/>
-          <w:szCs w:val="28"/>
-        </w:rPr>
-        <w:t>LastName</w:t>
-      </w:r>
-      <w:proofErr w:type="spellEnd"/>
-      <w:r>
-        <w:rPr>
-          <w:sz w:val="28"/>
-          <w:szCs w:val="28"/>
-        </w:rPr>
-        <w:t>)</w:t>
-      </w:r>
-    </w:p>
-    <w:p>
-      <w:pPr>
-        <w:pStyle w:val="TableParagraph"/>
-        <w:numPr>
-          <w:ilvl w:val="0"/>
-          <w:numId w:val="4"/>
-        </w:numPr>
-        <w:rPr>
-          <w:sz w:val="28"/>
-          <w:szCs w:val="28"/>
-        </w:rPr>
-      </w:pPr>
-      <w:r>
-        <w:rPr>
-          <w:sz w:val="28"/>
-          <w:szCs w:val="28"/>
-        </w:rPr>
-        <w:t xml:space="preserve">Create a tuple say t2 for marks of 5 subjects </w:t>
-      </w:r>
-    </w:p>
-    <w:p>
-      <w:pPr>
-        <w:pStyle w:val="TableParagraph"/>
-        <w:numPr>
-          <w:ilvl w:val="0"/>
-          <w:numId w:val="4"/>
-        </w:numPr>
-        <w:rPr>
-          <w:sz w:val="28"/>
-          <w:szCs w:val="28"/>
-        </w:rPr>
-      </w:pPr>
-      <w:r>
-        <w:rPr>
-          <w:sz w:val="28"/>
-          <w:szCs w:val="28"/>
-        </w:rPr>
-        <w:t>Make a total of all the marks and print it. (with and without using sum() method)</w:t>
-      </w:r>
-    </w:p>
-    <w:p>
-      <w:pPr>
-        <w:pStyle w:val="TableParagraph"/>
-        <w:numPr>
-          <w:ilvl w:val="0"/>
-          <w:numId w:val="4"/>
-        </w:numPr>
-        <w:rPr>
-          <w:sz w:val="28"/>
-          <w:szCs w:val="28"/>
-        </w:rPr>
-      </w:pPr>
-      <w:r>
-        <w:rPr>
-          <w:sz w:val="28"/>
-          <w:szCs w:val="28"/>
-        </w:rPr>
-        <w:t>Make a tuple t3 having 2 elements as t1 and t2 (tuples created above) – It is called a nested tuple</w:t>
-      </w:r>
-    </w:p>
-    <w:p>
-      <w:pPr>
-        <w:pStyle w:val="TableParagraph"/>
-        <w:numPr>
-          <w:ilvl w:val="0"/>
-          <w:numId w:val="4"/>
-        </w:numPr>
-        <w:rPr>
-          <w:sz w:val="28"/>
-          <w:szCs w:val="28"/>
-        </w:rPr>
-      </w:pPr>
-      <w:r>
-        <w:rPr>
-          <w:sz w:val="28"/>
-          <w:szCs w:val="28"/>
-        </w:rPr>
-        <w:t>Take an input number and find whether that is present as an element in the tuple t3 or not.</w:t>
-      </w:r>
-    </w:p>
-    <w:p>
-      <w:pPr>
-        <w:pStyle w:val="TableParagraph"/>
-        <w:numPr>
-          <w:ilvl w:val="0"/>
-          <w:numId w:val="4"/>
-        </w:numPr>
-        <w:rPr>
-          <w:sz w:val="28"/>
-          <w:szCs w:val="28"/>
-        </w:rPr>
-      </w:pPr>
-      <w:r>
-        <w:rPr>
-          <w:sz w:val="28"/>
-          <w:szCs w:val="28"/>
-        </w:rPr>
-        <w:t>Create a tuple of 5 fruits. Ask the user to input a fruit name and search that name in the given fruit tuple. Display suitable messages</w:t>
-      </w:r>
-    </w:p>
-    <w:p>
-      <w:pPr>
-        <w:pStyle w:val="TableParagraph"/>
-        <w:numPr>
-          <w:ilvl w:val="0"/>
-          <w:numId w:val="4"/>
-        </w:numPr>
-        <w:rPr>
-          <w:sz w:val="28"/>
-          <w:szCs w:val="28"/>
-        </w:rPr>
-      </w:pPr>
-      <w:r>
-        <w:rPr>
-          <w:sz w:val="28"/>
-          <w:szCs w:val="28"/>
-        </w:rPr>
-        <w:t>Create a tuple of cities of Gujarat by taking user input.</w:t>
-      </w:r>
-    </w:p>
-    <w:p>
-      <w:pPr>
-        <w:pStyle w:val="TableParagraph"/>
-        <w:numPr>
-          <w:ilvl w:val="0"/>
-          <w:numId w:val="4"/>
-        </w:numPr>
-        <w:rPr>
-          <w:sz w:val="28"/>
-          <w:szCs w:val="28"/>
-        </w:rPr>
-      </w:pPr>
-      <w:r>
-        <w:rPr>
-          <w:sz w:val="28"/>
-          <w:szCs w:val="28"/>
-        </w:rPr>
-        <w:t xml:space="preserve">Find the length of name of each city in the above tuple. With and without </w:t>
-      </w:r>
-      <w:proofErr w:type="spellStart"/>
-      <w:r>
-        <w:rPr>
-          <w:sz w:val="28"/>
-          <w:szCs w:val="28"/>
-        </w:rPr>
-        <w:t>len</w:t>
-      </w:r>
-      <w:proofErr w:type="spellEnd"/>
-      <w:r>
-        <w:rPr>
-          <w:sz w:val="28"/>
-          <w:szCs w:val="28"/>
-        </w:rPr>
-        <w:t>() method</w:t>
-      </w:r>
-    </w:p>
-    <w:p>
-      <w:pPr>
-        <w:pStyle w:val="TableParagraph"/>
-        <w:numPr>
-          <w:ilvl w:val="0"/>
-          <w:numId w:val="4"/>
-        </w:numPr>
-        <w:rPr>
-          <w:sz w:val="28"/>
-          <w:szCs w:val="28"/>
-        </w:rPr>
-      </w:pPr>
-      <w:r>
-        <w:rPr>
-          <w:sz w:val="28"/>
-          <w:szCs w:val="28"/>
-        </w:rPr>
-        <w:t>Create a nested tuple t4 of your (name, (hobbies), (friends), degree)</w:t>
-      </w:r>
-    </w:p>
-    <w:p>
-      <w:pPr>
-        <w:pStyle w:val="TableParagraph"/>
-        <w:numPr>
-          <w:ilvl w:val="0"/>
-          <w:numId w:val="4"/>
-        </w:numPr>
-        <w:rPr>
-          <w:sz w:val="28"/>
-          <w:szCs w:val="28"/>
-        </w:rPr>
-      </w:pPr>
-      <w:r>
-        <w:rPr>
-          <w:sz w:val="28"/>
-          <w:szCs w:val="28"/>
-        </w:rPr>
-        <w:t>Find an element in the nested tuple (t4) and print its position if found, otherwise print “Not found”</w:t>
-      </w:r>
-    </w:p>
-    <w:p>
-      <w:pPr>
-        <w:pStyle w:val="TableParagraph"/>
-        <w:numPr>
-          <w:ilvl w:val="0"/>
-          <w:numId w:val="4"/>
-        </w:numPr>
-        <w:rPr>
-          <w:sz w:val="28"/>
-          <w:szCs w:val="28"/>
-        </w:rPr>
-      </w:pPr>
-      <w:r>
-        <w:rPr>
-          <w:sz w:val="28"/>
-          <w:szCs w:val="28"/>
-        </w:rPr>
-        <w:t>Take a tuple of 10 integer numbers and segregate odd and even numbers in 2 different tuples.</w:t>
-      </w:r>
-    </w:p>
-    <w:p>
-      <w:pPr>
-        <w:pStyle w:val="TableParagraph"/>
-        <w:ind w:left="720"/>
-        <w:rPr>
-          <w:sz w:val="28"/>
-          <w:szCs w:val="28"/>
-        </w:rPr>
-      </w:pPr>
-    </w:p>
-    <w:p>
-      <w:pPr>
-        <w:pStyle w:val="TableParagraph"/>
-        <w:numPr>
-          <w:ilvl w:val="0"/>
-          <w:numId w:val="4"/>
-        </w:numPr>
-        <w:rPr>
-          <w:sz w:val="28"/>
-          <w:szCs w:val="28"/>
-        </w:rPr>
-      </w:pPr>
-      <w:r>
-        <w:rPr>
-          <w:sz w:val="28"/>
-          <w:szCs w:val="28"/>
-        </w:rPr>
-        <w:t>Create a list of students say L1</w:t>
-      </w:r>
     </w:p>
     <w:p>
       <w:pPr>
@@ -2834,14 +2954,7 @@
           <w:sz w:val="28"/>
           <w:szCs w:val="28"/>
         </w:rPr>
-        <w:t>Count total number of students from the list</w:t>
-      </w:r>
-      <w:r>
-        <w:rPr>
-          <w:sz w:val="28"/>
-          <w:szCs w:val="28"/>
-        </w:rPr>
-        <w:t xml:space="preserve"> L1</w:t>
+        <w:t>Remove the last student from the list L1</w:t>
       </w:r>
     </w:p>
     <w:p>
@@ -2861,7 +2974,7 @@
           <w:sz w:val="28"/>
           <w:szCs w:val="28"/>
         </w:rPr>
-        <w:t>Add one more student in the list L1</w:t>
+        <w:t>Remove a particular student from the list. (Take a name of student from the user.)</w:t>
       </w:r>
     </w:p>
     <w:p>
@@ -2881,7 +2994,235 @@
           <w:sz w:val="28"/>
           <w:szCs w:val="28"/>
         </w:rPr>
-        <w:t>Display all the students in the sorted order</w:t>
+        <w:t>While removing the student from the list, if multiple students have same name then remove all of them from the list.</w:t>
+      </w:r>
+    </w:p>
+    <w:p>
+      <w:pPr>
+        <w:pStyle w:val="TableParagraph"/>
+        <w:numPr>
+          <w:ilvl w:val="0"/>
+          <w:numId w:val="4"/>
+        </w:numPr>
+        <w:rPr>
+          <w:sz w:val="28"/>
+          <w:szCs w:val="28"/>
+        </w:rPr>
+      </w:pPr>
+      <w:r>
+        <w:rPr>
+          <w:sz w:val="28"/>
+          <w:szCs w:val="28"/>
+        </w:rPr>
+        <w:t>Create a list of 10 numbers and find the maximum and minimum numbers from it.</w:t>
+      </w:r>
+    </w:p>
+    <w:p>
+      <w:pPr>
+        <w:pStyle w:val="TableParagraph"/>
+        <w:numPr>
+          <w:ilvl w:val="0"/>
+          <w:numId w:val="4"/>
+        </w:numPr>
+        <w:rPr>
+          <w:sz w:val="28"/>
+          <w:szCs w:val="28"/>
+        </w:rPr>
+      </w:pPr>
+      <w:r>
+        <w:rPr>
+          <w:sz w:val="28"/>
+          <w:szCs w:val="28"/>
+        </w:rPr>
+        <w:t>Create a list of alphabets and count total number of vowels in it.</w:t>
+      </w:r>
+    </w:p>
+    <w:p>
+      <w:pPr>
+        <w:pStyle w:val="TableParagraph"/>
+        <w:numPr>
+          <w:ilvl w:val="0"/>
+          <w:numId w:val="4"/>
+        </w:numPr>
+        <w:rPr>
+          <w:sz w:val="28"/>
+          <w:szCs w:val="28"/>
+        </w:rPr>
+      </w:pPr>
+      <w:r>
+        <w:rPr>
+          <w:sz w:val="28"/>
+          <w:szCs w:val="28"/>
+        </w:rPr>
+        <w:t>Create a list of even numbers between 1 to 21 using range()</w:t>
+      </w:r>
+    </w:p>
+    <w:p>
+      <w:pPr>
+        <w:pStyle w:val="TableParagraph"/>
+        <w:numPr>
+          <w:ilvl w:val="0"/>
+          <w:numId w:val="4"/>
+        </w:numPr>
+        <w:rPr>
+          <w:sz w:val="28"/>
+          <w:szCs w:val="28"/>
+        </w:rPr>
+      </w:pPr>
+      <w:r>
+        <w:rPr>
+          <w:sz w:val="28"/>
+          <w:szCs w:val="28"/>
+        </w:rPr>
+        <w:t>Create a list of employees (nested list) with their personal details like [name, age, salary, expertise] in a list. Ask the user to enter name and display the details of that employee. If the employee is not in the list, print error message.</w:t>
+      </w:r>
+    </w:p>
+    <w:p>
+      <w:pPr>
+        <w:pStyle w:val="TableParagraph"/>
+        <w:numPr>
+          <w:ilvl w:val="0"/>
+          <w:numId w:val="4"/>
+        </w:numPr>
+        <w:rPr>
+          <w:sz w:val="28"/>
+          <w:szCs w:val="28"/>
+        </w:rPr>
+      </w:pPr>
+      <w:r>
+        <w:rPr>
+          <w:sz w:val="28"/>
+          <w:szCs w:val="28"/>
+        </w:rPr>
+        <w:t>Create a list by taking any 5 inputs from the user.</w:t>
+      </w:r>
+    </w:p>
+    <w:p>
+      <w:pPr>
+        <w:pStyle w:val="TableParagraph"/>
+        <w:numPr>
+          <w:ilvl w:val="0"/>
+          <w:numId w:val="4"/>
+        </w:numPr>
+        <w:rPr>
+          <w:sz w:val="28"/>
+          <w:szCs w:val="28"/>
+        </w:rPr>
+      </w:pPr>
+      <w:r>
+        <w:rPr>
+          <w:sz w:val="28"/>
+          <w:szCs w:val="28"/>
+        </w:rPr>
+        <w:t>Display the students from L1 list, whose name contains the character ‘a’.</w:t>
+      </w:r>
+    </w:p>
+    <w:p>
+      <w:pPr>
+        <w:pStyle w:val="TableParagraph"/>
+        <w:numPr>
+          <w:ilvl w:val="0"/>
+          <w:numId w:val="4"/>
+        </w:numPr>
+        <w:rPr>
+          <w:sz w:val="28"/>
+          <w:szCs w:val="28"/>
+        </w:rPr>
+      </w:pPr>
+      <w:r>
+        <w:rPr>
+          <w:sz w:val="28"/>
+          <w:szCs w:val="28"/>
+        </w:rPr>
+        <w:t>Create a list of 10 numbers and find the total of odd numbers and even numbers</w:t>
+      </w:r>
+    </w:p>
+    <w:p>
+      <w:pPr>
+        <w:pStyle w:val="TableParagraph"/>
+        <w:numPr>
+          <w:ilvl w:val="0"/>
+          <w:numId w:val="4"/>
+        </w:numPr>
+        <w:rPr>
+          <w:sz w:val="28"/>
+          <w:szCs w:val="28"/>
+        </w:rPr>
+      </w:pPr>
+      <w:r>
+        <w:rPr>
+          <w:sz w:val="28"/>
+          <w:szCs w:val="28"/>
+        </w:rPr>
+        <w:t xml:space="preserve">Put all the odd numbers in </w:t>
+      </w:r>
+      <w:r>
+        <w:rPr>
+          <w:sz w:val="28"/>
+          <w:szCs w:val="28"/>
+        </w:rPr>
+        <w:t>one</w:t>
+      </w:r>
+      <w:r>
+        <w:rPr>
+          <w:sz w:val="28"/>
+          <w:szCs w:val="28"/>
+        </w:rPr>
+        <w:t xml:space="preserve"> list and even numbers in another list.</w:t>
+      </w:r>
+    </w:p>
+    <w:p>
+      <w:pPr>
+        <w:pStyle w:val="TableParagraph"/>
+        <w:numPr>
+          <w:ilvl w:val="0"/>
+          <w:numId w:val="4"/>
+        </w:numPr>
+        <w:rPr>
+          <w:sz w:val="28"/>
+          <w:szCs w:val="28"/>
+        </w:rPr>
+      </w:pPr>
+      <w:r>
+        <w:rPr>
+          <w:sz w:val="28"/>
+          <w:szCs w:val="28"/>
+        </w:rPr>
+        <w:t>Create a list having mixed elements like string and integers. Print only integer elements from the list with and without using list comprehension</w:t>
+      </w:r>
+    </w:p>
+    <w:p>
+      <w:pPr>
+        <w:pStyle w:val="TableParagraph"/>
+        <w:numPr>
+          <w:ilvl w:val="0"/>
+          <w:numId w:val="4"/>
+        </w:numPr>
+        <w:rPr>
+          <w:sz w:val="28"/>
+          <w:szCs w:val="28"/>
+        </w:rPr>
+      </w:pPr>
+      <w:r>
+        <w:rPr>
+          <w:sz w:val="28"/>
+          <w:szCs w:val="28"/>
+        </w:rPr>
+        <w:t xml:space="preserve">Write a Python program to store student roll numbers in a set and </w:t>
+      </w:r>
+      <w:r>
+        <w:rPr>
+          <w:sz w:val="28"/>
+          <w:szCs w:val="28"/>
+        </w:rPr>
+        <w:t xml:space="preserve">prepare the sets according to the </w:t>
+      </w:r>
+      <w:r>
+        <w:rPr>
+          <w:sz w:val="28"/>
+          <w:szCs w:val="28"/>
+        </w:rPr>
+        <w:t>requirement of the question</w:t>
       </w:r>
     </w:p>
     <w:p>
@@ -2901,7 +3242,7 @@
           <w:sz w:val="28"/>
           <w:szCs w:val="28"/>
         </w:rPr>
-        <w:t>Check a particular student’s name is present in the list or not</w:t>
+        <w:t>Write a program to add new students to an existing class attendance set.</w:t>
       </w:r>
     </w:p>
     <w:p>
@@ -2921,22 +3262,41 @@
           <w:sz w:val="28"/>
           <w:szCs w:val="28"/>
         </w:rPr>
-        <w:t>If the student’s name is present in the list, print total number of same name students in the list L1 and display the position of 1</w:t>
-      </w:r>
-      <w:r>
-        <w:rPr>
-          <w:sz w:val="28"/>
-          <w:szCs w:val="28"/>
-          <w:vertAlign w:val="superscript"/>
-        </w:rPr>
-        <w:t>st</w:t>
-      </w:r>
-      <w:r>
-        <w:rPr>
-          <w:sz w:val="28"/>
-          <w:szCs w:val="28"/>
-        </w:rPr>
-        <w:t xml:space="preserve"> student</w:t>
+        <w:t>Write a program to remove students who are absent from the attendance set.</w:t>
+      </w:r>
+    </w:p>
+    <w:p>
+      <w:pPr>
+        <w:pStyle w:val="TableParagraph"/>
+        <w:numPr>
+          <w:ilvl w:val="0"/>
+          <w:numId w:val="4"/>
+        </w:numPr>
+        <w:rPr>
+          <w:sz w:val="28"/>
+          <w:szCs w:val="28"/>
+        </w:rPr>
+      </w:pPr>
+      <w:r>
+        <w:rPr>
+          <w:sz w:val="28"/>
+          <w:szCs w:val="28"/>
+        </w:rPr>
+        <w:t xml:space="preserve"> Create a sets of Courses and w</w:t>
+      </w:r>
+      <w:r>
+        <w:rPr>
+          <w:sz w:val="28"/>
+          <w:szCs w:val="28"/>
+        </w:rPr>
+        <w:t>rite a program to check whether a given student is enrolled in a particular course</w:t>
+      </w:r>
+      <w:r>
+        <w:rPr>
+          <w:sz w:val="28"/>
+          <w:szCs w:val="28"/>
+        </w:rPr>
+        <w:t xml:space="preserve"> or not.</w:t>
       </w:r>
     </w:p>
     <w:p>
@@ -2956,7 +3316,62 @@
           <w:sz w:val="28"/>
           <w:szCs w:val="28"/>
         </w:rPr>
-        <w:t>Remove the last student from the list L1</w:t>
+        <w:t xml:space="preserve">Write a program to find students who are enrolled in both </w:t>
+      </w:r>
+      <w:r>
+        <w:rPr>
+          <w:sz w:val="28"/>
+          <w:szCs w:val="28"/>
+        </w:rPr>
+        <w:t xml:space="preserve">the </w:t>
+      </w:r>
+      <w:r>
+        <w:rPr>
+          <w:sz w:val="28"/>
+          <w:szCs w:val="28"/>
+        </w:rPr>
+        <w:t>courses.</w:t>
+      </w:r>
+      <w:r>
+        <w:rPr>
+          <w:sz w:val="28"/>
+          <w:szCs w:val="28"/>
+        </w:rPr>
+        <w:t xml:space="preserve"> </w:t>
+      </w:r>
+    </w:p>
+    <w:p>
+      <w:pPr>
+        <w:pStyle w:val="TableParagraph"/>
+        <w:numPr>
+          <w:ilvl w:val="0"/>
+          <w:numId w:val="4"/>
+        </w:numPr>
+        <w:rPr>
+          <w:sz w:val="28"/>
+          <w:szCs w:val="28"/>
+        </w:rPr>
+      </w:pPr>
+      <w:r>
+        <w:rPr>
+          <w:sz w:val="28"/>
+          <w:szCs w:val="28"/>
+        </w:rPr>
+        <w:t xml:space="preserve">Create two sets of elective subjects chosen by the students. </w:t>
+      </w:r>
+      <w:r>
+        <w:rPr>
+          <w:sz w:val="28"/>
+          <w:szCs w:val="28"/>
+        </w:rPr>
+        <w:t>Write a program to find students who are enrolled in at lea</w:t>
+      </w:r>
+      <w:r>
+        <w:rPr>
+          <w:sz w:val="28"/>
+          <w:szCs w:val="28"/>
+        </w:rPr>
+        <w:t>st one of two elective subjects</w:t>
       </w:r>
     </w:p>
     <w:p>
@@ -2976,7 +3391,7 @@
           <w:sz w:val="28"/>
           <w:szCs w:val="28"/>
         </w:rPr>
-        <w:t>Remove a particular student from the list. (Take a name of student from the user.)</w:t>
+        <w:t>Write a program to find students who are enrolled only in Course A and not in Course B.</w:t>
       </w:r>
     </w:p>
     <w:p>
@@ -2996,243 +3411,21 @@
           <w:sz w:val="28"/>
           <w:szCs w:val="28"/>
         </w:rPr>
-        <w:t>While removing the student from the list, if multiple students have same name then remove all of them from the list.</w:t>
-      </w:r>
-    </w:p>
-    <w:p>
-      <w:pPr>
-        <w:pStyle w:val="TableParagraph"/>
-        <w:numPr>
-          <w:ilvl w:val="0"/>
-          <w:numId w:val="4"/>
-        </w:numPr>
-        <w:rPr>
-          <w:sz w:val="28"/>
-          <w:szCs w:val="28"/>
-        </w:rPr>
-      </w:pPr>
-      <w:r>
-        <w:rPr>
-          <w:sz w:val="28"/>
-          <w:szCs w:val="28"/>
-        </w:rPr>
-        <w:t>Create a list of 10 numbers and find the maximum and minimum numbers from it.</w:t>
-      </w:r>
-    </w:p>
-    <w:p>
-      <w:pPr>
-        <w:pStyle w:val="TableParagraph"/>
-        <w:numPr>
-          <w:ilvl w:val="0"/>
-          <w:numId w:val="4"/>
-        </w:numPr>
-        <w:rPr>
-          <w:sz w:val="28"/>
-          <w:szCs w:val="28"/>
-        </w:rPr>
-      </w:pPr>
-      <w:r>
-        <w:rPr>
-          <w:sz w:val="28"/>
-          <w:szCs w:val="28"/>
-        </w:rPr>
-        <w:t>Create a list of alphabets and count total number of vowels in it.</w:t>
-      </w:r>
-    </w:p>
-    <w:p>
-      <w:pPr>
-        <w:pStyle w:val="TableParagraph"/>
-        <w:numPr>
-          <w:ilvl w:val="0"/>
-          <w:numId w:val="4"/>
-        </w:numPr>
-        <w:rPr>
-          <w:sz w:val="28"/>
-          <w:szCs w:val="28"/>
-        </w:rPr>
-      </w:pPr>
-      <w:r>
-        <w:rPr>
-          <w:sz w:val="28"/>
-          <w:szCs w:val="28"/>
-        </w:rPr>
-        <w:t>Create a list of even numbers between 1 to 21 using range()</w:t>
-      </w:r>
-    </w:p>
-    <w:p>
-      <w:pPr>
-        <w:pStyle w:val="TableParagraph"/>
-        <w:numPr>
-          <w:ilvl w:val="0"/>
-          <w:numId w:val="4"/>
-        </w:numPr>
-        <w:rPr>
-          <w:sz w:val="28"/>
-          <w:szCs w:val="28"/>
-        </w:rPr>
-      </w:pPr>
-      <w:r>
-        <w:rPr>
-          <w:sz w:val="28"/>
-          <w:szCs w:val="28"/>
-        </w:rPr>
-        <w:t xml:space="preserve">Create a list of employees (nested list) with their personal details like [name, </w:t>
-      </w:r>
-      <w:r>
-        <w:rPr>
-          <w:sz w:val="28"/>
-          <w:szCs w:val="28"/>
-        </w:rPr>
-        <w:lastRenderedPageBreak/>
-        <w:t>age, salary, expertise] in a list. Ask the user to enter name and display the details of that employee. If the employee is not in the list, print error message.</w:t>
-      </w:r>
-    </w:p>
-    <w:p>
-      <w:pPr>
-        <w:pStyle w:val="TableParagraph"/>
-        <w:numPr>
-          <w:ilvl w:val="0"/>
-          <w:numId w:val="4"/>
-        </w:numPr>
-        <w:rPr>
-          <w:sz w:val="28"/>
-          <w:szCs w:val="28"/>
-        </w:rPr>
-      </w:pPr>
-      <w:r>
-        <w:rPr>
-          <w:sz w:val="28"/>
-          <w:szCs w:val="28"/>
-        </w:rPr>
-        <w:t>Create a list by taking any 5 inputs from the user.</w:t>
-      </w:r>
-    </w:p>
-    <w:p>
-      <w:pPr>
-        <w:pStyle w:val="TableParagraph"/>
-        <w:numPr>
-          <w:ilvl w:val="0"/>
-          <w:numId w:val="4"/>
-        </w:numPr>
-        <w:rPr>
-          <w:sz w:val="28"/>
-          <w:szCs w:val="28"/>
-        </w:rPr>
-      </w:pPr>
-      <w:r>
-        <w:rPr>
-          <w:sz w:val="28"/>
-          <w:szCs w:val="28"/>
-        </w:rPr>
-        <w:t>Display the students from L1 list, whose name contains the character ‘a’.</w:t>
-      </w:r>
-    </w:p>
-    <w:p>
-      <w:pPr>
-        <w:pStyle w:val="TableParagraph"/>
-        <w:numPr>
-          <w:ilvl w:val="0"/>
-          <w:numId w:val="4"/>
-        </w:numPr>
-        <w:rPr>
-          <w:sz w:val="28"/>
-          <w:szCs w:val="28"/>
-        </w:rPr>
-      </w:pPr>
-      <w:r>
-        <w:rPr>
-          <w:sz w:val="28"/>
-          <w:szCs w:val="28"/>
-        </w:rPr>
-        <w:t>Create a list of 10 numbers and find the total of odd numbers and even numbers</w:t>
-      </w:r>
-    </w:p>
-    <w:p>
-      <w:pPr>
-        <w:pStyle w:val="TableParagraph"/>
-        <w:numPr>
-          <w:ilvl w:val="0"/>
-          <w:numId w:val="4"/>
-        </w:numPr>
-        <w:rPr>
-          <w:sz w:val="28"/>
-          <w:szCs w:val="28"/>
-        </w:rPr>
-      </w:pPr>
-      <w:r>
-        <w:rPr>
-          <w:sz w:val="28"/>
-          <w:szCs w:val="28"/>
-        </w:rPr>
-        <w:t xml:space="preserve">Put all the odd numbers in </w:t>
-      </w:r>
-      <w:r>
-        <w:rPr>
-          <w:sz w:val="28"/>
-          <w:szCs w:val="28"/>
-        </w:rPr>
-        <w:t>one</w:t>
-      </w:r>
-      <w:r>
-        <w:rPr>
-          <w:sz w:val="28"/>
-          <w:szCs w:val="28"/>
-        </w:rPr>
-        <w:t xml:space="preserve"> list and even numbers in another list.</w:t>
-      </w:r>
-    </w:p>
-    <w:p>
-      <w:pPr>
-        <w:pStyle w:val="TableParagraph"/>
-        <w:numPr>
-          <w:ilvl w:val="0"/>
-          <w:numId w:val="4"/>
-        </w:numPr>
-        <w:rPr>
-          <w:sz w:val="28"/>
-          <w:szCs w:val="28"/>
-        </w:rPr>
-      </w:pPr>
-      <w:r>
-        <w:rPr>
-          <w:sz w:val="28"/>
-          <w:szCs w:val="28"/>
-        </w:rPr>
-        <w:t>Create a list having mixed elements like string and integers. Print only integer elements from the list with and without using list comprehension</w:t>
-      </w:r>
-    </w:p>
-    <w:p>
-      <w:pPr>
-        <w:pStyle w:val="TableParagraph"/>
-        <w:numPr>
-          <w:ilvl w:val="0"/>
-          <w:numId w:val="4"/>
-        </w:numPr>
-        <w:rPr>
-          <w:sz w:val="28"/>
-          <w:szCs w:val="28"/>
-        </w:rPr>
-      </w:pPr>
-      <w:r>
-        <w:rPr>
-          <w:sz w:val="28"/>
-          <w:szCs w:val="28"/>
-        </w:rPr>
-        <w:t xml:space="preserve">Write a Python program to store student roll numbers in a set and </w:t>
-      </w:r>
-      <w:r>
-        <w:rPr>
-          <w:sz w:val="28"/>
-          <w:szCs w:val="28"/>
-        </w:rPr>
-        <w:t xml:space="preserve">prepare the sets according to the </w:t>
-      </w:r>
-      <w:r>
-        <w:rPr>
-          <w:sz w:val="28"/>
-          <w:szCs w:val="28"/>
-        </w:rPr>
-        <w:t>requirement of the question</w:t>
+        <w:t>Write a program to find students who parti</w:t>
+      </w:r>
+      <w:r>
+        <w:rPr>
+          <w:sz w:val="28"/>
+          <w:szCs w:val="28"/>
+        </w:rPr>
+        <w:t>cipated in exactly one of two courses</w:t>
+      </w:r>
+      <w:r>
+        <w:rPr>
+          <w:sz w:val="28"/>
+          <w:szCs w:val="28"/>
+        </w:rPr>
+        <w:t>.</w:t>
       </w:r>
     </w:p>
     <w:p>
@@ -3252,209 +3445,6 @@
           <w:sz w:val="28"/>
           <w:szCs w:val="28"/>
         </w:rPr>
-        <w:t>Write a program to add new students to an existing class attendance set.</w:t>
-      </w:r>
-    </w:p>
-    <w:p>
-      <w:pPr>
-        <w:pStyle w:val="TableParagraph"/>
-        <w:numPr>
-          <w:ilvl w:val="1"/>
-          <w:numId w:val="4"/>
-        </w:numPr>
-        <w:rPr>
-          <w:sz w:val="28"/>
-          <w:szCs w:val="28"/>
-        </w:rPr>
-      </w:pPr>
-      <w:r>
-        <w:rPr>
-          <w:sz w:val="28"/>
-          <w:szCs w:val="28"/>
-        </w:rPr>
-        <w:t>Write a program to remove students who are absent from the attendance set.</w:t>
-      </w:r>
-    </w:p>
-    <w:p>
-      <w:pPr>
-        <w:pStyle w:val="TableParagraph"/>
-        <w:numPr>
-          <w:ilvl w:val="0"/>
-          <w:numId w:val="4"/>
-        </w:numPr>
-        <w:rPr>
-          <w:sz w:val="28"/>
-          <w:szCs w:val="28"/>
-        </w:rPr>
-      </w:pPr>
-      <w:r>
-        <w:rPr>
-          <w:sz w:val="28"/>
-          <w:szCs w:val="28"/>
-        </w:rPr>
-        <w:t xml:space="preserve"> Create a sets of Courses and w</w:t>
-      </w:r>
-      <w:r>
-        <w:rPr>
-          <w:sz w:val="28"/>
-          <w:szCs w:val="28"/>
-        </w:rPr>
-        <w:t>rite a program to check whether a given student is enrolled in a particular course</w:t>
-      </w:r>
-      <w:r>
-        <w:rPr>
-          <w:sz w:val="28"/>
-          <w:szCs w:val="28"/>
-        </w:rPr>
-        <w:t xml:space="preserve"> or not.</w:t>
-      </w:r>
-    </w:p>
-    <w:p>
-      <w:pPr>
-        <w:pStyle w:val="TableParagraph"/>
-        <w:numPr>
-          <w:ilvl w:val="1"/>
-          <w:numId w:val="4"/>
-        </w:numPr>
-        <w:rPr>
-          <w:sz w:val="28"/>
-          <w:szCs w:val="28"/>
-        </w:rPr>
-      </w:pPr>
-      <w:r>
-        <w:rPr>
-          <w:sz w:val="28"/>
-          <w:szCs w:val="28"/>
-        </w:rPr>
-        <w:t xml:space="preserve">Write a program to find students who are enrolled in both </w:t>
-      </w:r>
-      <w:r>
-        <w:rPr>
-          <w:sz w:val="28"/>
-          <w:szCs w:val="28"/>
-        </w:rPr>
-        <w:t xml:space="preserve">the </w:t>
-      </w:r>
-      <w:r>
-        <w:rPr>
-          <w:sz w:val="28"/>
-          <w:szCs w:val="28"/>
-        </w:rPr>
-        <w:t>courses.</w:t>
-      </w:r>
-      <w:r>
-        <w:rPr>
-          <w:sz w:val="28"/>
-          <w:szCs w:val="28"/>
-        </w:rPr>
-        <w:t xml:space="preserve"> </w:t>
-      </w:r>
-    </w:p>
-    <w:p>
-      <w:pPr>
-        <w:pStyle w:val="TableParagraph"/>
-        <w:numPr>
-          <w:ilvl w:val="0"/>
-          <w:numId w:val="4"/>
-        </w:numPr>
-        <w:rPr>
-          <w:sz w:val="28"/>
-          <w:szCs w:val="28"/>
-        </w:rPr>
-      </w:pPr>
-      <w:r>
-        <w:rPr>
-          <w:sz w:val="28"/>
-          <w:szCs w:val="28"/>
-        </w:rPr>
-        <w:t xml:space="preserve">Create two sets of elective subjects chosen by the students. </w:t>
-      </w:r>
-      <w:r>
-        <w:rPr>
-          <w:sz w:val="28"/>
-          <w:szCs w:val="28"/>
-        </w:rPr>
-        <w:t>Write a program to find students who are enrolled in at lea</w:t>
-      </w:r>
-      <w:r>
-        <w:rPr>
-          <w:sz w:val="28"/>
-          <w:szCs w:val="28"/>
-        </w:rPr>
-        <w:t>st one of two elective subjects</w:t>
-      </w:r>
-    </w:p>
-    <w:p>
-      <w:pPr>
-        <w:pStyle w:val="TableParagraph"/>
-        <w:numPr>
-          <w:ilvl w:val="1"/>
-          <w:numId w:val="4"/>
-        </w:numPr>
-        <w:rPr>
-          <w:sz w:val="28"/>
-          <w:szCs w:val="28"/>
-        </w:rPr>
-      </w:pPr>
-      <w:r>
-        <w:rPr>
-          <w:sz w:val="28"/>
-          <w:szCs w:val="28"/>
-        </w:rPr>
-        <w:t>Write a program to find students who are enrolled only in Course A and not in Course B.</w:t>
-      </w:r>
-    </w:p>
-    <w:p>
-      <w:pPr>
-        <w:pStyle w:val="TableParagraph"/>
-        <w:numPr>
-          <w:ilvl w:val="1"/>
-          <w:numId w:val="4"/>
-        </w:numPr>
-        <w:rPr>
-          <w:sz w:val="28"/>
-          <w:szCs w:val="28"/>
-        </w:rPr>
-      </w:pPr>
-      <w:r>
-        <w:rPr>
-          <w:sz w:val="28"/>
-          <w:szCs w:val="28"/>
-        </w:rPr>
-        <w:t>Write a program to find students who parti</w:t>
-      </w:r>
-      <w:r>
-        <w:rPr>
-          <w:sz w:val="28"/>
-          <w:szCs w:val="28"/>
-        </w:rPr>
-        <w:t>cipated in exactly one of two courses</w:t>
-      </w:r>
-      <w:r>
-        <w:rPr>
-          <w:sz w:val="28"/>
-          <w:szCs w:val="28"/>
-        </w:rPr>
-        <w:t>.</w:t>
-      </w:r>
-    </w:p>
-    <w:p>
-      <w:pPr>
-        <w:pStyle w:val="TableParagraph"/>
-        <w:numPr>
-          <w:ilvl w:val="1"/>
-          <w:numId w:val="4"/>
-        </w:numPr>
-        <w:rPr>
-          <w:sz w:val="28"/>
-          <w:szCs w:val="28"/>
-        </w:rPr>
-      </w:pPr>
-      <w:r>
-        <w:rPr>
-          <w:sz w:val="28"/>
-          <w:szCs w:val="28"/>
-        </w:rPr>
         <w:t xml:space="preserve">Write a program to remove duplicate student </w:t>
       </w:r>
       <w:r>
@@ -3810,7 +3800,6 @@
           <w:szCs w:val="28"/>
           <w:lang w:bidi="en-US"/>
         </w:rPr>
-        <w:lastRenderedPageBreak/>
         <w:t>club_B</w:t>
       </w:r>
       <w:proofErr w:type="spellEnd"/>
@@ -4828,15 +4817,7 @@
           <w:sz w:val="28"/>
           <w:szCs w:val="28"/>
         </w:rPr>
-        <w:t xml:space="preserve"> from the user and check if that employee is </w:t>
-      </w:r>
-      <w:r>
-        <w:rPr>
-          <w:sz w:val="28"/>
-          <w:szCs w:val="28"/>
-        </w:rPr>
-        <w:lastRenderedPageBreak/>
-        <w:t>there in the dictionary or not.</w:t>
+        <w:t xml:space="preserve"> from the user and check if that employee is there in the dictionary or not.</w:t>
       </w:r>
     </w:p>
     <w:p>
@@ -5374,7 +5355,6 @@
           <w:szCs w:val="28"/>
           <w:lang w:bidi="en-US"/>
         </w:rPr>
-        <w:lastRenderedPageBreak/>
         <w:t>Write an UDF to return a list having only unique values by removing duplicate values from the provided input list.</w:t>
       </w:r>
     </w:p>
@@ -6093,7 +6073,6 @@
           <w:szCs w:val="28"/>
           <w:lang w:bidi="en-US"/>
         </w:rPr>
-        <w:lastRenderedPageBreak/>
         <w:t>Create a lambda function that will return maximum of two numbers</w:t>
       </w:r>
     </w:p>
@@ -6844,17 +6823,7 @@
           <w:szCs w:val="28"/>
           <w:lang w:bidi="en-US"/>
         </w:rPr>
-        <w:t xml:space="preserve">Take a list of floating-point numbers and display list of all round numbers. </w:t>
-      </w:r>
-      <w:r>
-        <w:rPr>
-          <w:rFonts w:ascii="Times New Roman" w:eastAsia="Times New Roman" w:hAnsi="Times New Roman" w:cs="Times New Roman"/>
-          <w:sz w:val="28"/>
-          <w:szCs w:val="28"/>
-          <w:lang w:bidi="en-US"/>
-        </w:rPr>
-        <w:lastRenderedPageBreak/>
-        <w:t>Also round them with just 2 decimal points. Using map()</w:t>
+        <w:t>Take a list of floating-point numbers and display list of all round numbers. Also round them with just 2 decimal points. Using map()</w:t>
       </w:r>
     </w:p>
     <w:p>
@@ -7689,7 +7658,6 @@
           <w:szCs w:val="28"/>
           <w:lang w:bidi="en-US"/>
         </w:rPr>
-        <w:lastRenderedPageBreak/>
         <w:t>a. Take user input for creating entry of any new student (</w:t>
       </w:r>
       <w:proofErr w:type="spellStart"/>
@@ -8373,7 +8341,6 @@
           <w:sz w:val="28"/>
           <w:szCs w:val="28"/>
         </w:rPr>
-        <w:lastRenderedPageBreak/>
         <w:t>Take the user input for data to be written in the text file. Enter the data line by line, till ‘@’ character is entered by the user at the end.</w:t>
       </w:r>
     </w:p>
@@ -8998,7 +8965,6 @@
           <w:szCs w:val="28"/>
           <w:lang w:val="en-IN"/>
         </w:rPr>
-        <w:lastRenderedPageBreak/>
         <w:t>TypeError</w:t>
       </w:r>
       <w:proofErr w:type="spellEnd"/>
@@ -9780,7 +9746,6 @@
           <w:sz w:val="28"/>
           <w:szCs w:val="28"/>
         </w:rPr>
-        <w:lastRenderedPageBreak/>
         <w:t>cur.execute</w:t>
       </w:r>
       <w:proofErr w:type="spellEnd"/>
@@ -10493,7 +10458,6 @@
           <w:sz w:val="28"/>
           <w:szCs w:val="28"/>
         </w:rPr>
-        <w:lastRenderedPageBreak/>
         <w:t>Create a new text file</w:t>
       </w:r>
     </w:p>
@@ -11328,7 +11292,6 @@
           <w:sz w:val="28"/>
           <w:szCs w:val="28"/>
         </w:rPr>
-        <w:lastRenderedPageBreak/>
         <w:t>Search for a particular row using index value</w:t>
       </w:r>
     </w:p>
@@ -12184,7 +12147,6 @@
           <w:sz w:val="28"/>
           <w:szCs w:val="28"/>
         </w:rPr>
-        <w:lastRenderedPageBreak/>
         <w:t>Draw a pie chart for the student’s participation in different games</w:t>
       </w:r>
     </w:p>
@@ -17408,7 +17370,7 @@
 </file>
 
 <file path=customXml/itemProps1.xml><?xml version="1.0" encoding="utf-8"?>
-<ds:datastoreItem xmlns:ds="http://schemas.openxmlformats.org/officeDocument/2006/customXml" ds:itemID="{DCE7D94D-3E6E-44D2-9AC6-91B87E1340BB}">
+<ds:datastoreItem xmlns:ds="http://schemas.openxmlformats.org/officeDocument/2006/customXml" ds:itemID="{B679F346-8C65-4948-A59A-64AEB7F4236B}">
   <ds:schemaRefs>
     <ds:schemaRef ds:uri="http://schemas.openxmlformats.org/officeDocument/2006/bibliography"/>
   </ds:schemaRefs>

</xml_diff>